<commit_message>
checking about completeness of the 2010 birth data file
</commit_message>
<xml_diff>
--- a/notebooks/2010_Birth/First Stage 2010/01_missing_values_analysis.docx
+++ b/notebooks/2010_Birth/First Stage 2010/01_missing_values_analysis.docx
@@ -13,7 +13,7 @@
     </w:p>
     <w:p>
       <w:r>
-        <w:t>Generated: 2026-03-22 06:41</w:t>
+        <w:t>Generated: 2026-03-31 17:49</w:t>
       </w:r>
     </w:p>
     <w:p>
@@ -36,13 +36,13 @@
         <w:br/>
         <w:t>Key findings include:</w:t>
         <w:br/>
-        <w:t>• Total missing values: 409,674 (6.25% of all data)</w:t>
+        <w:t>• Total missing values: 45,850 (0.7% of all data)</w:t>
         <w:br/>
-        <w:t>• Columns with missing data: 4 out of 18 columns</w:t>
+        <w:t>• Columns with missing data: 3 out of 18 columns</w:t>
         <w:br/>
-        <w:t>• Columns with &gt;20% missing data: 1</w:t>
+        <w:t>• Columns with &gt;20% missing data: 0</w:t>
         <w:br/>
-        <w:t>• Best completed columns: ['Registered_Month2.0', 'Registered_Year', 'Registered_Month']</w:t>
+        <w:t>• Best completed columns: ['Registered_Year', 'Registered_Month2.0', 'Registered_Month']</w:t>
       </w:r>
     </w:p>
     <w:p>
@@ -168,7 +168,7 @@
               <w:jc w:val="right"/>
             </w:pPr>
             <w:r>
-              <w:t>4.0</w:t>
+              <w:t>3.0</w:t>
             </w:r>
           </w:p>
         </w:tc>
@@ -193,7 +193,7 @@
               <w:jc w:val="right"/>
             </w:pPr>
             <w:r>
-              <w:t>409674.0</w:t>
+              <w:t>45850.0</w:t>
             </w:r>
           </w:p>
         </w:tc>
@@ -218,7 +218,7 @@
               <w:jc w:val="right"/>
             </w:pPr>
             <w:r>
-              <w:t>6.25</w:t>
+              <w:t>0.7</w:t>
             </w:r>
           </w:p>
         </w:tc>
@@ -363,93 +363,6 @@
                 <w:b/>
               </w:rPr>
               <w:t>Completion %</w:t>
-            </w:r>
-          </w:p>
-        </w:tc>
-      </w:tr>
-      <w:tr>
-        <w:tc>
-          <w:tcPr>
-            <w:tcW w:type="dxa" w:w="1234"/>
-          </w:tcPr>
-          <w:p>
-            <w:r>
-              <w:t>Multiple_Birth_Status</w:t>
-            </w:r>
-          </w:p>
-        </w:tc>
-        <w:tc>
-          <w:tcPr>
-            <w:tcW w:type="dxa" w:w="1234"/>
-          </w:tcPr>
-          <w:p>
-            <w:pPr>
-              <w:jc w:val="right"/>
-            </w:pPr>
-            <w:r>
-              <w:t>363,824</w:t>
-            </w:r>
-          </w:p>
-        </w:tc>
-        <w:tc>
-          <w:tcPr>
-            <w:tcW w:type="dxa" w:w="1234"/>
-          </w:tcPr>
-          <w:p>
-            <w:pPr>
-              <w:jc w:val="right"/>
-            </w:pPr>
-            <w:r>
-              <w:t>100.0%</w:t>
-            </w:r>
-          </w:p>
-        </w:tc>
-        <w:tc>
-          <w:tcPr>
-            <w:tcW w:type="dxa" w:w="1234"/>
-          </w:tcPr>
-          <w:p>
-            <w:r>
-              <w:t>str</w:t>
-            </w:r>
-          </w:p>
-        </w:tc>
-        <w:tc>
-          <w:tcPr>
-            <w:tcW w:type="dxa" w:w="1234"/>
-          </w:tcPr>
-          <w:p>
-            <w:pPr>
-              <w:jc w:val="right"/>
-            </w:pPr>
-            <w:r>
-              <w:t>1</w:t>
-            </w:r>
-          </w:p>
-        </w:tc>
-        <w:tc>
-          <w:tcPr>
-            <w:tcW w:type="dxa" w:w="1234"/>
-          </w:tcPr>
-          <w:p>
-            <w:pPr>
-              <w:jc w:val="right"/>
-            </w:pPr>
-            <w:r>
-              <w:t>57</w:t>
-            </w:r>
-          </w:p>
-        </w:tc>
-        <w:tc>
-          <w:tcPr>
-            <w:tcW w:type="dxa" w:w="1234"/>
-          </w:tcPr>
-          <w:p>
-            <w:pPr>
-              <w:jc w:val="right"/>
-            </w:pPr>
-            <w:r>
-              <w:t>0.0%</w:t>
             </w:r>
           </w:p>
         </w:tc>
@@ -722,6 +635,93 @@
           </w:tcPr>
           <w:p>
             <w:r>
+              <w:t>Registered_Year</w:t>
+            </w:r>
+          </w:p>
+        </w:tc>
+        <w:tc>
+          <w:tcPr>
+            <w:tcW w:type="dxa" w:w="1234"/>
+          </w:tcPr>
+          <w:p>
+            <w:pPr>
+              <w:jc w:val="right"/>
+            </w:pPr>
+            <w:r>
+              <w:t>0</w:t>
+            </w:r>
+          </w:p>
+        </w:tc>
+        <w:tc>
+          <w:tcPr>
+            <w:tcW w:type="dxa" w:w="1234"/>
+          </w:tcPr>
+          <w:p>
+            <w:pPr>
+              <w:jc w:val="right"/>
+            </w:pPr>
+            <w:r>
+              <w:t>0.0%</w:t>
+            </w:r>
+          </w:p>
+        </w:tc>
+        <w:tc>
+          <w:tcPr>
+            <w:tcW w:type="dxa" w:w="1234"/>
+          </w:tcPr>
+          <w:p>
+            <w:r>
+              <w:t>int64</w:t>
+            </w:r>
+          </w:p>
+        </w:tc>
+        <w:tc>
+          <w:tcPr>
+            <w:tcW w:type="dxa" w:w="1234"/>
+          </w:tcPr>
+          <w:p>
+            <w:pPr>
+              <w:jc w:val="right"/>
+            </w:pPr>
+            <w:r>
+              <w:t>1</w:t>
+            </w:r>
+          </w:p>
+        </w:tc>
+        <w:tc>
+          <w:tcPr>
+            <w:tcW w:type="dxa" w:w="1234"/>
+          </w:tcPr>
+          <w:p>
+            <w:pPr>
+              <w:jc w:val="right"/>
+            </w:pPr>
+            <w:r>
+              <w:t>363,881</w:t>
+            </w:r>
+          </w:p>
+        </w:tc>
+        <w:tc>
+          <w:tcPr>
+            <w:tcW w:type="dxa" w:w="1234"/>
+          </w:tcPr>
+          <w:p>
+            <w:pPr>
+              <w:jc w:val="right"/>
+            </w:pPr>
+            <w:r>
+              <w:t>100.0%</w:t>
+            </w:r>
+          </w:p>
+        </w:tc>
+      </w:tr>
+      <w:tr>
+        <w:tc>
+          <w:tcPr>
+            <w:tcW w:type="dxa" w:w="1234"/>
+          </w:tcPr>
+          <w:p>
+            <w:r>
               <w:t>Registered_Month2.0</w:t>
             </w:r>
           </w:p>
@@ -809,7 +809,7 @@
           </w:tcPr>
           <w:p>
             <w:r>
-              <w:t>Registered_Year</w:t>
+              <w:t>Registered_Month</w:t>
             </w:r>
           </w:p>
         </w:tc>
@@ -845,7 +845,7 @@
           </w:tcPr>
           <w:p>
             <w:r>
-              <w:t>int64</w:t>
+              <w:t>str</w:t>
             </w:r>
           </w:p>
         </w:tc>
@@ -858,7 +858,7 @@
               <w:jc w:val="right"/>
             </w:pPr>
             <w:r>
-              <w:t>1</w:t>
+              <w:t>12</w:t>
             </w:r>
           </w:p>
         </w:tc>
@@ -896,7 +896,7 @@
           </w:tcPr>
           <w:p>
             <w:r>
-              <w:t>Registered_Month</w:t>
+              <w:t>Birth_Month.0</w:t>
             </w:r>
           </w:p>
         </w:tc>
@@ -932,7 +932,7 @@
           </w:tcPr>
           <w:p>
             <w:r>
-              <w:t>str</w:t>
+              <w:t>int64</w:t>
             </w:r>
           </w:p>
         </w:tc>
@@ -1505,7 +1505,7 @@
           </w:tcPr>
           <w:p>
             <w:r>
-              <w:t>Birth_Month.0</w:t>
+              <w:t>Multiple_Birth_Status</w:t>
             </w:r>
           </w:p>
         </w:tc>
@@ -1541,7 +1541,7 @@
           </w:tcPr>
           <w:p>
             <w:r>
-              <w:t>int64</w:t>
+              <w:t>str</w:t>
             </w:r>
           </w:p>
         </w:tc>
@@ -1554,7 +1554,7 @@
               <w:jc w:val="right"/>
             </w:pPr>
             <w:r>
-              <w:t>12</w:t>
+              <w:t>2</w:t>
             </w:r>
           </w:p>
         </w:tc>
@@ -2103,7 +2103,7 @@
       <w:jc w:val="center"/>
     </w:pPr>
     <w:r>
-      <w:t xml:space="preserve">Missing Values Analysis | Generated: 2026-03-22 | Page </w:t>
+      <w:t xml:space="preserve">Missing Values Analysis | Generated: 2026-03-31 | Page </w:t>
     </w:r>
     <w:r>
       <w:fldChar w:fldCharType="begin"/>

</xml_diff>